<commit_message>
Expand report design rationale and embed all 15 experiment screenshots
</commit_message>
<xml_diff>
--- a/阶段报告.docx
+++ b/阶段报告.docx
@@ -640,6 +640,11 @@
     </w:p>
     <w:p>
       <w:r>
+        <w:t>糖度、冰量和加料暂不进入，是因为首版按标准饮品记录销售，尚未建立规格和加料价格规则。原料配方和采购暂不进入，是因为原料的克、毫升等计量与可售杯数不同，需要先定义配方与出入库流水。支付/退款暂不进入，是因为本阶段尚未实现付款状态和退款核算；积分暂不进入，是因为尚未确定积分获取、兑换和冲销规则。</w:t>
+      </w:r>
+    </w:p>
+    <w:p>
+      <w:r>
         <w:t>业务步骤为选饮品和杯数、选择会员或匿名、录入订单头与多行明细、查看完成销售汇总、盘点并查看库存建议。取消单保存以便追踪但不计完成销售；盘点快照独立更新。本阶段没有将点单、支付和扣库存实现为一个结单事务。</w:t>
       </w:r>
     </w:p>
@@ -1101,7 +1106,22 @@
     </w:p>
     <w:p>
       <w:r>
-        <w:t>以上候选码均选为主码，没有将可变名称视为候选码。订单与饮品之间的多对多联系由明细表分解；金额用数量乘成交价计算，避免另存行金额、订单金额后出现不一致。成交价与菜单价代表不同时间的事实。采用外键而不启用级联删除，删除时先处理明细和快照，再处理订单和饮品。</w:t>
+        <w:t>以上候选码均选为主码。饮品名称和人员显示名允许重复且可能更改，不能唯一标识记录；联系方式虽对非空值唯一，但允许多个NULL，也不能标识所有会员，所以选择稳定的内部编码。明细不采用(订单号,饮品编码)作为候选码，因为同一订单允许同款饮品出现多行；(订单号,行号)才区分每一行，同一个行号又可以在不同订单中重复，因此必须使用复合主码。</w:t>
+      </w:r>
+    </w:p>
+    <w:p>
+      <w:r>
+        <w:t>将订单头与明细分开，是因为一张订单只有一个时间、经办员工和可选会员，却可以包含多款饮品；如果放在一张表，这些公共属性会在每行重复。订单与饮品之间的多对多联系由明细表分解。将菜单与库存分开，是因为菜单保存饮品定义和当前价，库存保存盘点数量和更新时间，两类信息需要独立维护。</w:t>
+      </w:r>
+    </w:p>
+    <w:p>
+      <w:r>
+        <w:t>关系基数为：一款饮品最多一份当前库存快照；一名员工可以经办多张订单；一位会员可以关联多张订单，而一张订单可以不关联会员；一张订单和一款饮品都可以对应多行明细。外码限制每个快照、订单和明细引用已存在的对象，避免孤立记录。</w:t>
+      </w:r>
+    </w:p>
+    <w:p>
+      <w:r>
+        <w:t>金额用数量乘成交价计算，避免另存行金额、订单金额后出现不一致。成交价与菜单价代表不同时间的事实。采用外键而不启用级联删除，删除时先处理明细和快照，再处理订单和饮品。</w:t>
       </w:r>
     </w:p>
     <w:p>
@@ -1575,6 +1595,510 @@
         <w:t>数据库角色shop_clerk与shop_manager分别授权，再通过无登录用户course_clerk_demo与course_manager_demo执行身份切换；所有测试写入回滚。顾客不配置数据库用户，由店员代录。权限仅说明数据库授权边界，尚未实现应用登录与身份认证。</w:t>
       </w:r>
     </w:p>
+    <w:tbl>
+      <w:tblPr>
+        <w:tblW w:type="auto" w:w="0"/>
+        <w:tblLayout w:type="fixed"/>
+        <w:tblLook w:firstColumn="1" w:firstRow="1" w:lastColumn="0" w:lastRow="0" w:noHBand="0" w:noVBand="1" w:val="04A0"/>
+        <w:tblBorders>
+          <w:top w:val="single" w:sz="4" w:color="D9D9D9"/>
+          <w:left w:val="single" w:sz="4" w:color="D9D9D9"/>
+          <w:bottom w:val="single" w:sz="4" w:color="D9D9D9"/>
+          <w:right w:val="single" w:sz="4" w:color="D9D9D9"/>
+          <w:insideH w:val="single" w:sz="4" w:color="D9D9D9"/>
+          <w:insideV w:val="single" w:sz="4" w:color="D9D9D9"/>
+        </w:tblBorders>
+        <w:tblCellMar>
+          <w:top w:w="85" w:type="dxa"/>
+          <w:bottom w:w="85" w:type="dxa"/>
+          <w:left w:w="85" w:type="dxa"/>
+          <w:right w:w="85" w:type="dxa"/>
+        </w:tblCellMar>
+      </w:tblPr>
+      <w:tblGrid>
+        <w:gridCol w:w="2409"/>
+        <w:gridCol w:w="2409"/>
+        <w:gridCol w:w="2409"/>
+        <w:gridCol w:w="2409"/>
+      </w:tblGrid>
+      <w:tr>
+        <w:trPr>
+          <w:cantSplit/>
+          <w:tblHeader/>
+        </w:trPr>
+        <w:tc>
+          <w:tcPr>
+            <w:tcW w:type="dxa" w:w="2409"/>
+            <w:shd w:fill="F2F2F2"/>
+          </w:tcPr>
+          <w:p>
+            <w:pPr>
+              <w:keepNext/>
+              <w:spacing w:after="40" w:line="252" w:lineRule="auto"/>
+            </w:pPr>
+            <w:r>
+              <w:rPr>
+                <w:b/>
+                <w:sz w:val="19"/>
+              </w:rPr>
+              <w:t>数据对象</w:t>
+            </w:r>
+          </w:p>
+        </w:tc>
+        <w:tc>
+          <w:tcPr>
+            <w:tcW w:type="dxa" w:w="2409"/>
+            <w:shd w:fill="F2F2F2"/>
+          </w:tcPr>
+          <w:p>
+            <w:pPr>
+              <w:keepNext/>
+              <w:spacing w:after="40" w:line="252" w:lineRule="auto"/>
+            </w:pPr>
+            <w:r>
+              <w:rPr>
+                <w:b/>
+                <w:sz w:val="19"/>
+              </w:rPr>
+              <w:t>店员读取</w:t>
+            </w:r>
+          </w:p>
+        </w:tc>
+        <w:tc>
+          <w:tcPr>
+            <w:tcW w:type="dxa" w:w="2409"/>
+            <w:shd w:fill="F2F2F2"/>
+          </w:tcPr>
+          <w:p>
+            <w:pPr>
+              <w:keepNext/>
+              <w:spacing w:after="40" w:line="252" w:lineRule="auto"/>
+            </w:pPr>
+            <w:r>
+              <w:rPr>
+                <w:b/>
+                <w:sz w:val="19"/>
+              </w:rPr>
+              <w:t>店员写入</w:t>
+            </w:r>
+          </w:p>
+        </w:tc>
+        <w:tc>
+          <w:tcPr>
+            <w:tcW w:type="dxa" w:w="2409"/>
+            <w:shd w:fill="F2F2F2"/>
+          </w:tcPr>
+          <w:p>
+            <w:pPr>
+              <w:keepNext/>
+              <w:spacing w:after="40" w:line="252" w:lineRule="auto"/>
+            </w:pPr>
+            <w:r>
+              <w:rPr>
+                <w:b/>
+                <w:sz w:val="19"/>
+              </w:rPr>
+              <w:t>店长权限</w:t>
+            </w:r>
+          </w:p>
+        </w:tc>
+      </w:tr>
+      <w:tr>
+        <w:trPr>
+          <w:cantSplit/>
+        </w:trPr>
+        <w:tc>
+          <w:tcPr>
+            <w:tcW w:type="dxa" w:w="2409"/>
+          </w:tcPr>
+          <w:p>
+            <w:pPr>
+              <w:keepNext/>
+              <w:spacing w:after="40" w:line="252" w:lineRule="auto"/>
+            </w:pPr>
+            <w:r>
+              <w:rPr>
+                <w:b w:val="0"/>
+                <w:sz w:val="19"/>
+              </w:rPr>
+              <w:t>Product、Inventory</w:t>
+            </w:r>
+          </w:p>
+        </w:tc>
+        <w:tc>
+          <w:tcPr>
+            <w:tcW w:type="dxa" w:w="2409"/>
+          </w:tcPr>
+          <w:p>
+            <w:pPr>
+              <w:keepNext/>
+              <w:spacing w:after="40" w:line="252" w:lineRule="auto"/>
+            </w:pPr>
+            <w:r>
+              <w:rPr>
+                <w:b w:val="0"/>
+                <w:sz w:val="19"/>
+              </w:rPr>
+              <w:t>允许</w:t>
+            </w:r>
+          </w:p>
+        </w:tc>
+        <w:tc>
+          <w:tcPr>
+            <w:tcW w:type="dxa" w:w="2409"/>
+          </w:tcPr>
+          <w:p>
+            <w:pPr>
+              <w:keepNext/>
+              <w:spacing w:after="40" w:line="252" w:lineRule="auto"/>
+            </w:pPr>
+            <w:r>
+              <w:rPr>
+                <w:b w:val="0"/>
+                <w:sz w:val="19"/>
+              </w:rPr>
+              <w:t>不授予增改删</w:t>
+            </w:r>
+          </w:p>
+        </w:tc>
+        <w:tc>
+          <w:tcPr>
+            <w:tcW w:type="dxa" w:w="2409"/>
+          </w:tcPr>
+          <w:p>
+            <w:pPr>
+              <w:keepNext/>
+              <w:spacing w:after="40" w:line="252" w:lineRule="auto"/>
+            </w:pPr>
+            <w:r>
+              <w:rPr>
+                <w:b w:val="0"/>
+                <w:sz w:val="19"/>
+              </w:rPr>
+              <w:t>读取、增改删</w:t>
+            </w:r>
+          </w:p>
+        </w:tc>
+      </w:tr>
+      <w:tr>
+        <w:trPr>
+          <w:cantSplit/>
+        </w:trPr>
+        <w:tc>
+          <w:tcPr>
+            <w:tcW w:type="dxa" w:w="2409"/>
+          </w:tcPr>
+          <w:p>
+            <w:pPr>
+              <w:keepNext/>
+              <w:spacing w:after="40" w:line="252" w:lineRule="auto"/>
+            </w:pPr>
+            <w:r>
+              <w:rPr>
+                <w:b w:val="0"/>
+                <w:sz w:val="19"/>
+              </w:rPr>
+              <w:t>Member、Employee</w:t>
+            </w:r>
+          </w:p>
+        </w:tc>
+        <w:tc>
+          <w:tcPr>
+            <w:tcW w:type="dxa" w:w="2409"/>
+          </w:tcPr>
+          <w:p>
+            <w:pPr>
+              <w:keepNext/>
+              <w:spacing w:after="40" w:line="252" w:lineRule="auto"/>
+            </w:pPr>
+            <w:r>
+              <w:rPr>
+                <w:b w:val="0"/>
+                <w:sz w:val="19"/>
+              </w:rPr>
+              <w:t>不授予</w:t>
+            </w:r>
+          </w:p>
+        </w:tc>
+        <w:tc>
+          <w:tcPr>
+            <w:tcW w:type="dxa" w:w="2409"/>
+          </w:tcPr>
+          <w:p>
+            <w:pPr>
+              <w:keepNext/>
+              <w:spacing w:after="40" w:line="252" w:lineRule="auto"/>
+            </w:pPr>
+            <w:r>
+              <w:rPr>
+                <w:b w:val="0"/>
+                <w:sz w:val="19"/>
+              </w:rPr>
+              <w:t>不授予</w:t>
+            </w:r>
+          </w:p>
+        </w:tc>
+        <w:tc>
+          <w:tcPr>
+            <w:tcW w:type="dxa" w:w="2409"/>
+          </w:tcPr>
+          <w:p>
+            <w:pPr>
+              <w:keepNext/>
+              <w:spacing w:after="40" w:line="252" w:lineRule="auto"/>
+            </w:pPr>
+            <w:r>
+              <w:rPr>
+                <w:b w:val="0"/>
+                <w:sz w:val="19"/>
+              </w:rPr>
+              <w:t>读取、增改删</w:t>
+            </w:r>
+          </w:p>
+        </w:tc>
+      </w:tr>
+      <w:tr>
+        <w:trPr>
+          <w:cantSplit/>
+        </w:trPr>
+        <w:tc>
+          <w:tcPr>
+            <w:tcW w:type="dxa" w:w="2409"/>
+          </w:tcPr>
+          <w:p>
+            <w:pPr>
+              <w:keepNext/>
+              <w:spacing w:after="40" w:line="252" w:lineRule="auto"/>
+            </w:pPr>
+            <w:r>
+              <w:rPr>
+                <w:b w:val="0"/>
+                <w:sz w:val="19"/>
+              </w:rPr>
+              <w:t>ShopOrder、OrderLine</w:t>
+            </w:r>
+          </w:p>
+        </w:tc>
+        <w:tc>
+          <w:tcPr>
+            <w:tcW w:type="dxa" w:w="2409"/>
+          </w:tcPr>
+          <w:p>
+            <w:pPr>
+              <w:keepNext/>
+              <w:spacing w:after="40" w:line="252" w:lineRule="auto"/>
+            </w:pPr>
+            <w:r>
+              <w:rPr>
+                <w:b w:val="0"/>
+                <w:sz w:val="19"/>
+              </w:rPr>
+              <w:t>不授予直接读表；通过订单视图查看</w:t>
+            </w:r>
+          </w:p>
+        </w:tc>
+        <w:tc>
+          <w:tcPr>
+            <w:tcW w:type="dxa" w:w="2409"/>
+          </w:tcPr>
+          <w:p>
+            <w:pPr>
+              <w:keepNext/>
+              <w:spacing w:after="40" w:line="252" w:lineRule="auto"/>
+            </w:pPr>
+            <w:r>
+              <w:rPr>
+                <w:b w:val="0"/>
+                <w:sz w:val="19"/>
+              </w:rPr>
+              <w:t>仅INSERT，不授予UPDATE/DELETE</w:t>
+            </w:r>
+          </w:p>
+        </w:tc>
+        <w:tc>
+          <w:tcPr>
+            <w:tcW w:type="dxa" w:w="2409"/>
+          </w:tcPr>
+          <w:p>
+            <w:pPr>
+              <w:keepNext/>
+              <w:spacing w:after="40" w:line="252" w:lineRule="auto"/>
+            </w:pPr>
+            <w:r>
+              <w:rPr>
+                <w:b w:val="0"/>
+                <w:sz w:val="19"/>
+              </w:rPr>
+              <w:t>读取、增改删</w:t>
+            </w:r>
+          </w:p>
+        </w:tc>
+      </w:tr>
+      <w:tr>
+        <w:trPr>
+          <w:cantSplit/>
+        </w:trPr>
+        <w:tc>
+          <w:tcPr>
+            <w:tcW w:type="dxa" w:w="2409"/>
+          </w:tcPr>
+          <w:p>
+            <w:pPr>
+              <w:keepNext/>
+              <w:spacing w:after="40" w:line="252" w:lineRule="auto"/>
+            </w:pPr>
+            <w:r>
+              <w:rPr>
+                <w:b w:val="0"/>
+                <w:sz w:val="19"/>
+              </w:rPr>
+              <w:t>vw_OrderDetail、vw_ProductSales、vw_InventoryStatus</w:t>
+            </w:r>
+          </w:p>
+        </w:tc>
+        <w:tc>
+          <w:tcPr>
+            <w:tcW w:type="dxa" w:w="2409"/>
+          </w:tcPr>
+          <w:p>
+            <w:pPr>
+              <w:keepNext/>
+              <w:spacing w:after="40" w:line="252" w:lineRule="auto"/>
+            </w:pPr>
+            <w:r>
+              <w:rPr>
+                <w:b w:val="0"/>
+                <w:sz w:val="19"/>
+              </w:rPr>
+              <w:t>允许</w:t>
+            </w:r>
+          </w:p>
+        </w:tc>
+        <w:tc>
+          <w:tcPr>
+            <w:tcW w:type="dxa" w:w="2409"/>
+          </w:tcPr>
+          <w:p>
+            <w:pPr>
+              <w:keepNext/>
+              <w:spacing w:after="40" w:line="252" w:lineRule="auto"/>
+            </w:pPr>
+            <w:r>
+              <w:rPr>
+                <w:b w:val="0"/>
+                <w:sz w:val="19"/>
+              </w:rPr>
+              <w:t>不授予</w:t>
+            </w:r>
+          </w:p>
+        </w:tc>
+        <w:tc>
+          <w:tcPr>
+            <w:tcW w:type="dxa" w:w="2409"/>
+          </w:tcPr>
+          <w:p>
+            <w:pPr>
+              <w:keepNext/>
+              <w:spacing w:after="40" w:line="252" w:lineRule="auto"/>
+            </w:pPr>
+            <w:r>
+              <w:rPr>
+                <w:b w:val="0"/>
+                <w:sz w:val="19"/>
+              </w:rPr>
+              <w:t>读取</w:t>
+            </w:r>
+          </w:p>
+        </w:tc>
+      </w:tr>
+      <w:tr>
+        <w:trPr>
+          <w:cantSplit/>
+        </w:trPr>
+        <w:tc>
+          <w:tcPr>
+            <w:tcW w:type="dxa" w:w="2409"/>
+          </w:tcPr>
+          <w:p>
+            <w:pPr>
+              <w:keepNext w:val="0"/>
+              <w:spacing w:after="40" w:line="252" w:lineRule="auto"/>
+            </w:pPr>
+            <w:r>
+              <w:rPr>
+                <w:b w:val="0"/>
+                <w:sz w:val="19"/>
+              </w:rPr>
+              <w:t>vw_MemberConsumption</w:t>
+            </w:r>
+          </w:p>
+        </w:tc>
+        <w:tc>
+          <w:tcPr>
+            <w:tcW w:type="dxa" w:w="2409"/>
+          </w:tcPr>
+          <w:p>
+            <w:pPr>
+              <w:keepNext w:val="0"/>
+              <w:spacing w:after="40" w:line="252" w:lineRule="auto"/>
+            </w:pPr>
+            <w:r>
+              <w:rPr>
+                <w:b w:val="0"/>
+                <w:sz w:val="19"/>
+              </w:rPr>
+              <w:t>不授予</w:t>
+            </w:r>
+          </w:p>
+        </w:tc>
+        <w:tc>
+          <w:tcPr>
+            <w:tcW w:type="dxa" w:w="2409"/>
+          </w:tcPr>
+          <w:p>
+            <w:pPr>
+              <w:keepNext w:val="0"/>
+              <w:spacing w:after="40" w:line="252" w:lineRule="auto"/>
+            </w:pPr>
+            <w:r>
+              <w:rPr>
+                <w:b w:val="0"/>
+                <w:sz w:val="19"/>
+              </w:rPr>
+              <w:t>不授予</w:t>
+            </w:r>
+          </w:p>
+        </w:tc>
+        <w:tc>
+          <w:tcPr>
+            <w:tcW w:type="dxa" w:w="2409"/>
+          </w:tcPr>
+          <w:p>
+            <w:pPr>
+              <w:keepNext w:val="0"/>
+              <w:spacing w:after="40" w:line="252" w:lineRule="auto"/>
+            </w:pPr>
+            <w:r>
+              <w:rPr>
+                <w:b w:val="0"/>
+                <w:sz w:val="19"/>
+              </w:rPr>
+              <w:t>读取</w:t>
+            </w:r>
+          </w:p>
+        </w:tc>
+      </w:tr>
+    </w:tbl>
+    <w:p>
+      <w:pPr>
+        <w:spacing w:after="0"/>
+      </w:pPr>
+    </w:p>
+    <w:p>
+      <w:r>
+        <w:t>店员只读日常点单所需的数据，并通过视图查看订单和统计；会员联系方式与消费汇总交由店长访问。员工表的JobTitle描述业务岗位，真正执行授权的是上述数据库角色，二者不会自动关联。</w:t>
+      </w:r>
+    </w:p>
     <w:p>
       <w:pPr>
         <w:pStyle w:val="Heading1"/>
@@ -1603,6 +2127,254 @@
     </w:p>
     <w:p>
       <w:pPr>
+        <w:pStyle w:val="Caption"/>
+        <w:keepNext/>
+      </w:pPr>
+      <w:r>
+        <w:t>图1  成功建库：MilkTeaShopV01状态为ONLINE</w:t>
+      </w:r>
+    </w:p>
+    <w:p>
+      <w:pPr>
+        <w:keepNext/>
+        <w:spacing w:after="60"/>
+      </w:pPr>
+      <w:r>
+        <w:drawing>
+          <wp:inline xmlns:a="http://schemas.openxmlformats.org/drawingml/2006/main" xmlns:pic="http://schemas.openxmlformats.org/drawingml/2006/picture">
+            <wp:extent cx="6120000" cy="2984152"/>
+            <wp:docPr id="1" name="Picture 1"/>
+            <wp:cNvGraphicFramePr>
+              <a:graphicFrameLocks noChangeAspect="1"/>
+            </wp:cNvGraphicFramePr>
+            <a:graphic>
+              <a:graphicData uri="http://schemas.openxmlformats.org/drawingml/2006/picture">
+                <pic:pic>
+                  <pic:nvPicPr>
+                    <pic:cNvPr id="0" name="00_database_creation.png"/>
+                    <pic:cNvPicPr/>
+                  </pic:nvPicPr>
+                  <pic:blipFill>
+                    <a:blip r:embed="rId11"/>
+                    <a:stretch>
+                      <a:fillRect/>
+                    </a:stretch>
+                  </pic:blipFill>
+                  <pic:spPr>
+                    <a:xfrm>
+                      <a:off x="0" y="0"/>
+                      <a:ext cx="6120000" cy="2984152"/>
+                    </a:xfrm>
+                    <a:prstGeom prst="rect"/>
+                  </pic:spPr>
+                </pic:pic>
+              </a:graphicData>
+            </a:graphic>
+          </wp:inline>
+        </w:drawing>
+      </w:r>
+    </w:p>
+    <w:p>
+      <w:pPr>
+        <w:pStyle w:val="Caption"/>
+      </w:pPr>
+      <w:r>
+        <w:t>原始截图：result/screenshots/00_database_creation.png</w:t>
+      </w:r>
+    </w:p>
+    <w:p>
+      <w:r>
+        <w:t>SQL00的实际返回显示新数据库已创建且状态为ONLINE，随后才能在该库内建表。</w:t>
+      </w:r>
+    </w:p>
+    <w:p>
+      <w:pPr>
+        <w:pStyle w:val="Caption"/>
+        <w:keepNext/>
+      </w:pPr>
+      <w:r>
+        <w:t>图2  建表结果：六张业务表及其字段结构</w:t>
+      </w:r>
+    </w:p>
+    <w:p>
+      <w:pPr>
+        <w:keepNext/>
+        <w:spacing w:after="60"/>
+      </w:pPr>
+      <w:r>
+        <w:drawing>
+          <wp:inline xmlns:a="http://schemas.openxmlformats.org/drawingml/2006/main" xmlns:pic="http://schemas.openxmlformats.org/drawingml/2006/picture">
+            <wp:extent cx="6120000" cy="2984152"/>
+            <wp:docPr id="2" name="Picture 2"/>
+            <wp:cNvGraphicFramePr>
+              <a:graphicFrameLocks noChangeAspect="1"/>
+            </wp:cNvGraphicFramePr>
+            <a:graphic>
+              <a:graphicData uri="http://schemas.openxmlformats.org/drawingml/2006/picture">
+                <pic:pic>
+                  <pic:nvPicPr>
+                    <pic:cNvPr id="0" name="01_schema.png"/>
+                    <pic:cNvPicPr/>
+                  </pic:nvPicPr>
+                  <pic:blipFill>
+                    <a:blip r:embed="rId12"/>
+                    <a:stretch>
+                      <a:fillRect/>
+                    </a:stretch>
+                  </pic:blipFill>
+                  <pic:spPr>
+                    <a:xfrm>
+                      <a:off x="0" y="0"/>
+                      <a:ext cx="6120000" cy="2984152"/>
+                    </a:xfrm>
+                    <a:prstGeom prst="rect"/>
+                  </pic:spPr>
+                </pic:pic>
+              </a:graphicData>
+            </a:graphic>
+          </wp:inline>
+        </w:drawing>
+      </w:r>
+    </w:p>
+    <w:p>
+      <w:pPr>
+        <w:pStyle w:val="Caption"/>
+      </w:pPr>
+      <w:r>
+        <w:t>原始截图：result/screenshots/01_schema.png</w:t>
+      </w:r>
+    </w:p>
+    <w:p>
+      <w:r>
+        <w:t>SQL01的结构查询列出六张表，表名与设计部分一致；字段与键的完整定义见SQL01和数据字典。</w:t>
+      </w:r>
+    </w:p>
+    <w:p>
+      <w:pPr>
+        <w:pStyle w:val="Caption"/>
+        <w:keepNext/>
+      </w:pPr>
+      <w:r>
+        <w:t>图3  样例装载：六表行数为6、6、4、3、7、11</w:t>
+      </w:r>
+    </w:p>
+    <w:p>
+      <w:pPr>
+        <w:keepNext/>
+        <w:spacing w:after="60"/>
+      </w:pPr>
+      <w:r>
+        <w:drawing>
+          <wp:inline xmlns:a="http://schemas.openxmlformats.org/drawingml/2006/main" xmlns:pic="http://schemas.openxmlformats.org/drawingml/2006/picture">
+            <wp:extent cx="6120000" cy="2984152"/>
+            <wp:docPr id="3" name="Picture 3"/>
+            <wp:cNvGraphicFramePr>
+              <a:graphicFrameLocks noChangeAspect="1"/>
+            </wp:cNvGraphicFramePr>
+            <a:graphic>
+              <a:graphicData uri="http://schemas.openxmlformats.org/drawingml/2006/picture">
+                <pic:pic>
+                  <pic:nvPicPr>
+                    <pic:cNvPr id="0" name="01_seed.png"/>
+                    <pic:cNvPicPr/>
+                  </pic:nvPicPr>
+                  <pic:blipFill>
+                    <a:blip r:embed="rId13"/>
+                    <a:stretch>
+                      <a:fillRect/>
+                    </a:stretch>
+                  </pic:blipFill>
+                  <pic:spPr>
+                    <a:xfrm>
+                      <a:off x="0" y="0"/>
+                      <a:ext cx="6120000" cy="2984152"/>
+                    </a:xfrm>
+                    <a:prstGeom prst="rect"/>
+                  </pic:spPr>
+                </pic:pic>
+              </a:graphicData>
+            </a:graphic>
+          </wp:inline>
+        </w:drawing>
+      </w:r>
+    </w:p>
+    <w:p>
+      <w:pPr>
+        <w:pStyle w:val="Caption"/>
+      </w:pPr>
+      <w:r>
+        <w:t>原始截图：result/screenshots/01_seed.png</w:t>
+      </w:r>
+    </w:p>
+    <w:p>
+      <w:r>
+        <w:t>SQL02执行后核对每表行数，确认全部关联样例已装载，每表至少三行。</w:t>
+      </w:r>
+    </w:p>
+    <w:p>
+      <w:pPr>
+        <w:pStyle w:val="Caption"/>
+        <w:keepNext/>
+      </w:pPr>
+      <w:r>
+        <w:t>图4  菜单更新：六款饮品的当前参考价格</w:t>
+      </w:r>
+    </w:p>
+    <w:p>
+      <w:pPr>
+        <w:keepNext/>
+        <w:spacing w:after="60"/>
+      </w:pPr>
+      <w:r>
+        <w:drawing>
+          <wp:inline xmlns:a="http://schemas.openxmlformats.org/drawingml/2006/main" xmlns:pic="http://schemas.openxmlformats.org/drawingml/2006/picture">
+            <wp:extent cx="6120000" cy="2984152"/>
+            <wp:docPr id="4" name="Picture 4"/>
+            <wp:cNvGraphicFramePr>
+              <a:graphicFrameLocks noChangeAspect="1"/>
+            </wp:cNvGraphicFramePr>
+            <a:graphic>
+              <a:graphicData uri="http://schemas.openxmlformats.org/drawingml/2006/picture">
+                <pic:pic>
+                  <pic:nvPicPr>
+                    <pic:cNvPr id="0" name="01_public_menu.png"/>
+                    <pic:cNvPicPr/>
+                  </pic:nvPicPr>
+                  <pic:blipFill>
+                    <a:blip r:embed="rId14"/>
+                    <a:stretch>
+                      <a:fillRect/>
+                    </a:stretch>
+                  </pic:blipFill>
+                  <pic:spPr>
+                    <a:xfrm>
+                      <a:off x="0" y="0"/>
+                      <a:ext cx="6120000" cy="2984152"/>
+                    </a:xfrm>
+                    <a:prstGeom prst="rect"/>
+                  </pic:spPr>
+                </pic:pic>
+              </a:graphicData>
+            </a:graphic>
+          </wp:inline>
+        </w:drawing>
+      </w:r>
+    </w:p>
+    <w:p>
+      <w:pPr>
+        <w:pStyle w:val="Caption"/>
+      </w:pPr>
+      <w:r>
+        <w:t>原始截图：result/screenshots/01_public_menu.png</w:t>
+      </w:r>
+    </w:p>
+    <w:p>
+      <w:r>
+        <w:t>SQL09仅更新菜单目录的当前名称、分类和价格；历史明细成交价不被该语句覆盖。</w:t>
+      </w:r>
+    </w:p>
+    <w:p>
+      <w:pPr>
         <w:pStyle w:val="Heading2"/>
       </w:pPr>
       <w:r>
@@ -1622,6 +2394,130 @@
     <w:p>
       <w:r>
         <w:t>修改前用WHERE确认目标记录，修改后再次查询，删除时观察影响行数。截图02_crud.png、02_crud_deletes.png展示前后变化和回滚，完整输出见result/03_crud.txt。</w:t>
+      </w:r>
+    </w:p>
+    <w:p>
+      <w:pPr>
+        <w:pStyle w:val="Caption"/>
+        <w:keepNext/>
+      </w:pPr>
+      <w:r>
+        <w:t>图5  CRUD新增与修改：菜单单价和盘点杯数的前后变化</w:t>
+      </w:r>
+    </w:p>
+    <w:p>
+      <w:pPr>
+        <w:keepNext/>
+        <w:spacing w:after="60"/>
+      </w:pPr>
+      <w:r>
+        <w:drawing>
+          <wp:inline xmlns:a="http://schemas.openxmlformats.org/drawingml/2006/main" xmlns:pic="http://schemas.openxmlformats.org/drawingml/2006/picture">
+            <wp:extent cx="6120000" cy="2984152"/>
+            <wp:docPr id="5" name="Picture 5"/>
+            <wp:cNvGraphicFramePr>
+              <a:graphicFrameLocks noChangeAspect="1"/>
+            </wp:cNvGraphicFramePr>
+            <a:graphic>
+              <a:graphicData uri="http://schemas.openxmlformats.org/drawingml/2006/picture">
+                <pic:pic>
+                  <pic:nvPicPr>
+                    <pic:cNvPr id="0" name="02_crud.png"/>
+                    <pic:cNvPicPr/>
+                  </pic:nvPicPr>
+                  <pic:blipFill>
+                    <a:blip r:embed="rId15"/>
+                    <a:stretch>
+                      <a:fillRect/>
+                    </a:stretch>
+                  </pic:blipFill>
+                  <pic:spPr>
+                    <a:xfrm>
+                      <a:off x="0" y="0"/>
+                      <a:ext cx="6120000" cy="2984152"/>
+                    </a:xfrm>
+                    <a:prstGeom prst="rect"/>
+                  </pic:spPr>
+                </pic:pic>
+              </a:graphicData>
+            </a:graphic>
+          </wp:inline>
+        </w:drawing>
+      </w:r>
+    </w:p>
+    <w:p>
+      <w:pPr>
+        <w:pStyle w:val="Caption"/>
+      </w:pPr>
+      <w:r>
+        <w:t>原始截图：result/screenshots/02_crud.png</w:t>
+      </w:r>
+    </w:p>
+    <w:p>
+      <w:r>
+        <w:t>查询新增的D999后再修改，观察菜单价2.00→2.50、预警阈值10→6以及库存0→7；这些变化证明UPDATE作用于目标记录。</w:t>
+      </w:r>
+    </w:p>
+    <w:p>
+      <w:pPr>
+        <w:pStyle w:val="Caption"/>
+        <w:keepNext/>
+      </w:pPr>
+      <w:r>
+        <w:t>图6  CRUD删除与回滚：删除行数及恢复基线</w:t>
+      </w:r>
+    </w:p>
+    <w:p>
+      <w:pPr>
+        <w:keepNext/>
+        <w:spacing w:after="60"/>
+      </w:pPr>
+      <w:r>
+        <w:drawing>
+          <wp:inline xmlns:a="http://schemas.openxmlformats.org/drawingml/2006/main" xmlns:pic="http://schemas.openxmlformats.org/drawingml/2006/picture">
+            <wp:extent cx="6120000" cy="2984152"/>
+            <wp:docPr id="6" name="Picture 6"/>
+            <wp:cNvGraphicFramePr>
+              <a:graphicFrameLocks noChangeAspect="1"/>
+            </wp:cNvGraphicFramePr>
+            <a:graphic>
+              <a:graphicData uri="http://schemas.openxmlformats.org/drawingml/2006/picture">
+                <pic:pic>
+                  <pic:nvPicPr>
+                    <pic:cNvPr id="0" name="02_crud_deletes.png"/>
+                    <pic:cNvPicPr/>
+                  </pic:nvPicPr>
+                  <pic:blipFill>
+                    <a:blip r:embed="rId16"/>
+                    <a:stretch>
+                      <a:fillRect/>
+                    </a:stretch>
+                  </pic:blipFill>
+                  <pic:spPr>
+                    <a:xfrm>
+                      <a:off x="0" y="0"/>
+                      <a:ext cx="6120000" cy="2984152"/>
+                    </a:xfrm>
+                    <a:prstGeom prst="rect"/>
+                  </pic:spPr>
+                </pic:pic>
+              </a:graphicData>
+            </a:graphic>
+          </wp:inline>
+        </w:drawing>
+      </w:r>
+    </w:p>
+    <w:p>
+      <w:pPr>
+        <w:pStyle w:val="Caption"/>
+      </w:pPr>
+      <w:r>
+        <w:t>原始截图：result/screenshots/02_crud_deletes.png</w:t>
+      </w:r>
+    </w:p>
+    <w:p>
+      <w:r>
+        <w:t>饮品、库存、订单头和明细的删除各影响1行；事务回滚后临时记录归零，饮品恢复为原来的6行。窗口未显示的订单状态与明细数量结果可在03_crud.txt逐项查看。</w:t>
       </w:r>
     </w:p>
     <w:p>
@@ -2005,6 +2901,254 @@
     </w:p>
     <w:p>
       <w:pPr>
+        <w:pStyle w:val="Caption"/>
+        <w:keepNext/>
+      </w:pPr>
+      <w:r>
+        <w:t>图7  关键连接查询：订单头、明细、菜单及经办人的关联结果</w:t>
+      </w:r>
+    </w:p>
+    <w:p>
+      <w:pPr>
+        <w:keepNext/>
+        <w:spacing w:after="60"/>
+      </w:pPr>
+      <w:r>
+        <w:drawing>
+          <wp:inline xmlns:a="http://schemas.openxmlformats.org/drawingml/2006/main" xmlns:pic="http://schemas.openxmlformats.org/drawingml/2006/picture">
+            <wp:extent cx="6120000" cy="2984152"/>
+            <wp:docPr id="7" name="Picture 7"/>
+            <wp:cNvGraphicFramePr>
+              <a:graphicFrameLocks noChangeAspect="1"/>
+            </wp:cNvGraphicFramePr>
+            <a:graphic>
+              <a:graphicData uri="http://schemas.openxmlformats.org/drawingml/2006/picture">
+                <pic:pic>
+                  <pic:nvPicPr>
+                    <pic:cNvPr id="0" name="03_queries.png"/>
+                    <pic:cNvPicPr/>
+                  </pic:nvPicPr>
+                  <pic:blipFill>
+                    <a:blip r:embed="rId17"/>
+                    <a:stretch>
+                      <a:fillRect/>
+                    </a:stretch>
+                  </pic:blipFill>
+                  <pic:spPr>
+                    <a:xfrm>
+                      <a:off x="0" y="0"/>
+                      <a:ext cx="6120000" cy="2984152"/>
+                    </a:xfrm>
+                    <a:prstGeom prst="rect"/>
+                  </pic:spPr>
+                </pic:pic>
+              </a:graphicData>
+            </a:graphic>
+          </wp:inline>
+        </w:drawing>
+      </w:r>
+    </w:p>
+    <w:p>
+      <w:pPr>
+        <w:pStyle w:val="Caption"/>
+      </w:pPr>
+      <w:r>
+        <w:t>原始截图：result/screenshots/03_queries.png</w:t>
+      </w:r>
+    </w:p>
+    <w:p>
+      <w:r>
+        <w:t>多表JOIN让一条销售明细同时呈现订单、饮品和经办信息。按完成状态筛选后再聚合，取消单不会增加完成销售金额。</w:t>
+      </w:r>
+    </w:p>
+    <w:p>
+      <w:pPr>
+        <w:pStyle w:val="Caption"/>
+        <w:keepNext/>
+      </w:pPr>
+      <w:r>
+        <w:t>图8  订单明细视图与饮品销售视图</w:t>
+      </w:r>
+    </w:p>
+    <w:p>
+      <w:pPr>
+        <w:keepNext/>
+        <w:spacing w:after="60"/>
+      </w:pPr>
+      <w:r>
+        <w:drawing>
+          <wp:inline xmlns:a="http://schemas.openxmlformats.org/drawingml/2006/main" xmlns:pic="http://schemas.openxmlformats.org/drawingml/2006/picture">
+            <wp:extent cx="6120000" cy="2984152"/>
+            <wp:docPr id="8" name="Picture 8"/>
+            <wp:cNvGraphicFramePr>
+              <a:graphicFrameLocks noChangeAspect="1"/>
+            </wp:cNvGraphicFramePr>
+            <a:graphic>
+              <a:graphicData uri="http://schemas.openxmlformats.org/drawingml/2006/picture">
+                <pic:pic>
+                  <pic:nvPicPr>
+                    <pic:cNvPr id="0" name="04_views.png"/>
+                    <pic:cNvPicPr/>
+                  </pic:nvPicPr>
+                  <pic:blipFill>
+                    <a:blip r:embed="rId18"/>
+                    <a:stretch>
+                      <a:fillRect/>
+                    </a:stretch>
+                  </pic:blipFill>
+                  <pic:spPr>
+                    <a:xfrm>
+                      <a:off x="0" y="0"/>
+                      <a:ext cx="6120000" cy="2984152"/>
+                    </a:xfrm>
+                    <a:prstGeom prst="rect"/>
+                  </pic:spPr>
+                </pic:pic>
+              </a:graphicData>
+            </a:graphic>
+          </wp:inline>
+        </w:drawing>
+      </w:r>
+    </w:p>
+    <w:p>
+      <w:pPr>
+        <w:pStyle w:val="Caption"/>
+      </w:pPr>
+      <w:r>
+        <w:t>原始截图：result/screenshots/04_views.png</w:t>
+      </w:r>
+    </w:p>
+    <w:p>
+      <w:r>
+        <w:t>vw_OrderDetail用于追踪包括取消单在内的明细，vw_ProductSales按完成单汇总。两种视图服务于不同目的，所以筛选口径不同。</w:t>
+      </w:r>
+    </w:p>
+    <w:p>
+      <w:pPr>
+        <w:pStyle w:val="Caption"/>
+        <w:keepNext/>
+      </w:pPr>
+      <w:r>
+        <w:t>图9  库存、会员与销量报表：阈值建议及零记录保留</w:t>
+      </w:r>
+    </w:p>
+    <w:p>
+      <w:pPr>
+        <w:keepNext/>
+        <w:spacing w:after="60"/>
+      </w:pPr>
+      <w:r>
+        <w:drawing>
+          <wp:inline xmlns:a="http://schemas.openxmlformats.org/drawingml/2006/main" xmlns:pic="http://schemas.openxmlformats.org/drawingml/2006/picture">
+            <wp:extent cx="6120000" cy="2984152"/>
+            <wp:docPr id="9" name="Picture 9"/>
+            <wp:cNvGraphicFramePr>
+              <a:graphicFrameLocks noChangeAspect="1"/>
+            </wp:cNvGraphicFramePr>
+            <a:graphic>
+              <a:graphicData uri="http://schemas.openxmlformats.org/drawingml/2006/picture">
+                <pic:pic>
+                  <pic:nvPicPr>
+                    <pic:cNvPr id="0" name="09_reporting.png"/>
+                    <pic:cNvPicPr/>
+                  </pic:nvPicPr>
+                  <pic:blipFill>
+                    <a:blip r:embed="rId19"/>
+                    <a:stretch>
+                      <a:fillRect/>
+                    </a:stretch>
+                  </pic:blipFill>
+                  <pic:spPr>
+                    <a:xfrm>
+                      <a:off x="0" y="0"/>
+                      <a:ext cx="6120000" cy="2984152"/>
+                    </a:xfrm>
+                    <a:prstGeom prst="rect"/>
+                  </pic:spPr>
+                </pic:pic>
+              </a:graphicData>
+            </a:graphic>
+          </wp:inline>
+        </w:drawing>
+      </w:r>
+    </w:p>
+    <w:p>
+      <w:pPr>
+        <w:pStyle w:val="Caption"/>
+      </w:pPr>
+      <w:r>
+        <w:t>原始截图：result/screenshots/09_reporting.png</w:t>
+      </w:r>
+    </w:p>
+    <w:p>
+      <w:r>
+        <w:t>D002等于阈值仍预警，D003低于阈值、D004为零库存，建议杯数分别为12、11、12；会员汇总保留M004的零消费，饮品销量保留D005/D006的零销量。</w:t>
+      </w:r>
+    </w:p>
+    <w:p>
+      <w:pPr>
+        <w:pStyle w:val="Caption"/>
+        <w:keepNext/>
+      </w:pPr>
+      <w:r>
+        <w:t>图10  HAVING与业务子查询：累计消费边界和高于平均价饮品</w:t>
+      </w:r>
+    </w:p>
+    <w:p>
+      <w:pPr>
+        <w:keepNext/>
+        <w:spacing w:after="60"/>
+      </w:pPr>
+      <w:r>
+        <w:drawing>
+          <wp:inline xmlns:a="http://schemas.openxmlformats.org/drawingml/2006/main" xmlns:pic="http://schemas.openxmlformats.org/drawingml/2006/picture">
+            <wp:extent cx="6120000" cy="2984152"/>
+            <wp:docPr id="10" name="Picture 10"/>
+            <wp:cNvGraphicFramePr>
+              <a:graphicFrameLocks noChangeAspect="1"/>
+            </wp:cNvGraphicFramePr>
+            <a:graphic>
+              <a:graphicData uri="http://schemas.openxmlformats.org/drawingml/2006/picture">
+                <pic:pic>
+                  <pic:nvPicPr>
+                    <pic:cNvPr id="0" name="10_reporting_queries.png"/>
+                    <pic:cNvPicPr/>
+                  </pic:nvPicPr>
+                  <pic:blipFill>
+                    <a:blip r:embed="rId20"/>
+                    <a:stretch>
+                      <a:fillRect/>
+                    </a:stretch>
+                  </pic:blipFill>
+                  <pic:spPr>
+                    <a:xfrm>
+                      <a:off x="0" y="0"/>
+                      <a:ext cx="6120000" cy="2984152"/>
+                    </a:xfrm>
+                    <a:prstGeom prst="rect"/>
+                  </pic:spPr>
+                </pic:pic>
+              </a:graphicData>
+            </a:graphic>
+          </wp:inline>
+        </w:drawing>
+      </w:r>
+    </w:p>
+    <w:p>
+      <w:pPr>
+        <w:pStyle w:val="Caption"/>
+      </w:pPr>
+      <w:r>
+        <w:t>原始截图：result/screenshots/10_reporting_queries.png</w:t>
+      </w:r>
+    </w:p>
+    <w:p>
+      <w:r>
+        <w:t>HAVING累计金额≥10返回M001和恰好10元的M003；高于在售菜单平均价5.50元的子查询返回D001、D002、D004，按上表数值核算可得到相同结果。</w:t>
+      </w:r>
+    </w:p>
+    <w:p>
+      <w:pPr>
         <w:pStyle w:val="Heading2"/>
       </w:pPr>
       <w:r>
@@ -2026,6 +3170,699 @@
         <w:t>完整性结果见05_constraints.png、05_constraints_details.png及06_constraints.txt。店员/店长允许与拒绝结果见06_clerk_permissions.png及07_roles.txt。反例同时检查目标错误号、约束名和临时数据清理，不把任意失败当成测试成功。</w:t>
       </w:r>
     </w:p>
+    <w:tbl>
+      <w:tblPr>
+        <w:tblW w:type="auto" w:w="0"/>
+        <w:tblLayout w:type="fixed"/>
+        <w:tblLook w:firstColumn="1" w:firstRow="1" w:lastColumn="0" w:lastRow="0" w:noHBand="0" w:noVBand="1" w:val="04A0"/>
+        <w:tblBorders>
+          <w:top w:val="single" w:sz="4" w:color="D9D9D9"/>
+          <w:left w:val="single" w:sz="4" w:color="D9D9D9"/>
+          <w:bottom w:val="single" w:sz="4" w:color="D9D9D9"/>
+          <w:right w:val="single" w:sz="4" w:color="D9D9D9"/>
+          <w:insideH w:val="single" w:sz="4" w:color="D9D9D9"/>
+          <w:insideV w:val="single" w:sz="4" w:color="D9D9D9"/>
+        </w:tblBorders>
+        <w:tblCellMar>
+          <w:top w:w="85" w:type="dxa"/>
+          <w:bottom w:w="85" w:type="dxa"/>
+          <w:left w:w="85" w:type="dxa"/>
+          <w:right w:w="85" w:type="dxa"/>
+        </w:tblCellMar>
+      </w:tblPr>
+      <w:tblGrid>
+        <w:gridCol w:w="2835"/>
+        <w:gridCol w:w="2835"/>
+        <w:gridCol w:w="3969"/>
+      </w:tblGrid>
+      <w:tr>
+        <w:trPr>
+          <w:cantSplit/>
+          <w:tblHeader/>
+        </w:trPr>
+        <w:tc>
+          <w:tcPr>
+            <w:tcW w:type="dxa" w:w="2835"/>
+            <w:shd w:fill="F2F2F2"/>
+          </w:tcPr>
+          <w:p>
+            <w:pPr>
+              <w:keepNext/>
+              <w:spacing w:after="40" w:line="252" w:lineRule="auto"/>
+            </w:pPr>
+            <w:r>
+              <w:rPr>
+                <w:b/>
+                <w:sz w:val="19"/>
+              </w:rPr>
+              <w:t>实际测试</w:t>
+            </w:r>
+          </w:p>
+        </w:tc>
+        <w:tc>
+          <w:tcPr>
+            <w:tcW w:type="dxa" w:w="2835"/>
+            <w:shd w:fill="F2F2F2"/>
+          </w:tcPr>
+          <w:p>
+            <w:pPr>
+              <w:keepNext/>
+              <w:spacing w:after="40" w:line="252" w:lineRule="auto"/>
+            </w:pPr>
+            <w:r>
+              <w:rPr>
+                <w:b/>
+                <w:sz w:val="19"/>
+              </w:rPr>
+              <w:t>输入或操作</w:t>
+            </w:r>
+          </w:p>
+        </w:tc>
+        <w:tc>
+          <w:tcPr>
+            <w:tcW w:type="dxa" w:w="3969"/>
+            <w:shd w:fill="F2F2F2"/>
+          </w:tcPr>
+          <w:p>
+            <w:pPr>
+              <w:keepNext/>
+              <w:spacing w:after="40" w:line="252" w:lineRule="auto"/>
+            </w:pPr>
+            <w:r>
+              <w:rPr>
+                <w:b/>
+                <w:sz w:val="19"/>
+              </w:rPr>
+              <w:t>实际结果与结论</w:t>
+            </w:r>
+          </w:p>
+        </w:tc>
+      </w:tr>
+      <w:tr>
+        <w:trPr>
+          <w:cantSplit/>
+        </w:trPr>
+        <w:tc>
+          <w:tcPr>
+            <w:tcW w:type="dxa" w:w="2835"/>
+          </w:tcPr>
+          <w:p>
+            <w:pPr>
+              <w:keepNext/>
+              <w:spacing w:after="40" w:line="252" w:lineRule="auto"/>
+            </w:pPr>
+            <w:r>
+              <w:rPr>
+                <w:b w:val="0"/>
+                <w:sz w:val="19"/>
+              </w:rPr>
+              <w:t>合法默认值/NULL对照</w:t>
+            </w:r>
+          </w:p>
+        </w:tc>
+        <w:tc>
+          <w:tcPr>
+            <w:tcW w:type="dxa" w:w="2835"/>
+          </w:tcPr>
+          <w:p>
+            <w:pPr>
+              <w:keepNext/>
+              <w:spacing w:after="40" w:line="252" w:lineRule="auto"/>
+            </w:pPr>
+            <w:r>
+              <w:rPr>
+                <w:b w:val="0"/>
+                <w:sz w:val="19"/>
+              </w:rPr>
+              <w:t>D998菜单价1.00；省略阈值、库存杯数、订单会员及状态</w:t>
+            </w:r>
+          </w:p>
+        </w:tc>
+        <w:tc>
+          <w:tcPr>
+            <w:tcW w:type="dxa" w:w="3969"/>
+          </w:tcPr>
+          <w:p>
+            <w:pPr>
+              <w:keepNext/>
+              <w:spacing w:after="40" w:line="252" w:lineRule="auto"/>
+            </w:pPr>
+            <w:r>
+              <w:rPr>
+                <w:b w:val="0"/>
+                <w:sz w:val="19"/>
+              </w:rPr>
+              <w:t>插入成功：默认阈值10、库存0、会员NULL、状态COMPLETED；最后回滚。</w:t>
+            </w:r>
+          </w:p>
+        </w:tc>
+      </w:tr>
+      <w:tr>
+        <w:trPr>
+          <w:cantSplit/>
+        </w:trPr>
+        <w:tc>
+          <w:tcPr>
+            <w:tcW w:type="dxa" w:w="2835"/>
+          </w:tcPr>
+          <w:p>
+            <w:pPr>
+              <w:keepNext/>
+              <w:spacing w:after="40" w:line="252" w:lineRule="auto"/>
+            </w:pPr>
+            <w:r>
+              <w:rPr>
+                <w:b w:val="0"/>
+                <w:sz w:val="19"/>
+              </w:rPr>
+              <w:t>非法库存</w:t>
+            </w:r>
+          </w:p>
+        </w:tc>
+        <w:tc>
+          <w:tcPr>
+            <w:tcW w:type="dxa" w:w="2835"/>
+          </w:tcPr>
+          <w:p>
+            <w:pPr>
+              <w:keepNext/>
+              <w:spacing w:after="40" w:line="252" w:lineRule="auto"/>
+            </w:pPr>
+            <w:r>
+              <w:rPr>
+                <w:b w:val="0"/>
+                <w:sz w:val="19"/>
+              </w:rPr>
+              <w:t>为D998插入Quantity=-1</w:t>
+            </w:r>
+          </w:p>
+        </w:tc>
+        <w:tc>
+          <w:tcPr>
+            <w:tcW w:type="dxa" w:w="3969"/>
+          </w:tcPr>
+          <w:p>
+            <w:pPr>
+              <w:keepNext/>
+              <w:spacing w:after="40" w:line="252" w:lineRule="auto"/>
+            </w:pPr>
+            <w:r>
+              <w:rPr>
+                <w:b w:val="0"/>
+                <w:sz w:val="19"/>
+              </w:rPr>
+              <w:t>错误547，CK_Inventory_Quantity_Nonnegative；负库存被CHECK拒绝。</w:t>
+            </w:r>
+          </w:p>
+        </w:tc>
+      </w:tr>
+      <w:tr>
+        <w:trPr>
+          <w:cantSplit/>
+        </w:trPr>
+        <w:tc>
+          <w:tcPr>
+            <w:tcW w:type="dxa" w:w="2835"/>
+          </w:tcPr>
+          <w:p>
+            <w:pPr>
+              <w:keepNext/>
+              <w:spacing w:after="40" w:line="252" w:lineRule="auto"/>
+            </w:pPr>
+            <w:r>
+              <w:rPr>
+                <w:b w:val="0"/>
+                <w:sz w:val="19"/>
+              </w:rPr>
+              <w:t>重复主码</w:t>
+            </w:r>
+          </w:p>
+        </w:tc>
+        <w:tc>
+          <w:tcPr>
+            <w:tcW w:type="dxa" w:w="2835"/>
+          </w:tcPr>
+          <w:p>
+            <w:pPr>
+              <w:keepNext/>
+              <w:spacing w:after="40" w:line="252" w:lineRule="auto"/>
+            </w:pPr>
+            <w:r>
+              <w:rPr>
+                <w:b w:val="0"/>
+                <w:sz w:val="19"/>
+              </w:rPr>
+              <w:t>再插入已存在的MT-20261001-001</w:t>
+            </w:r>
+          </w:p>
+        </w:tc>
+        <w:tc>
+          <w:tcPr>
+            <w:tcW w:type="dxa" w:w="3969"/>
+          </w:tcPr>
+          <w:p>
+            <w:pPr>
+              <w:keepNext/>
+              <w:spacing w:after="40" w:line="252" w:lineRule="auto"/>
+            </w:pPr>
+            <w:r>
+              <w:rPr>
+                <w:b w:val="0"/>
+                <w:sz w:val="19"/>
+              </w:rPr>
+              <w:t>错误2627，PK_ShopOrder；同一订单号不能重复。</w:t>
+            </w:r>
+          </w:p>
+        </w:tc>
+      </w:tr>
+      <w:tr>
+        <w:trPr>
+          <w:cantSplit/>
+        </w:trPr>
+        <w:tc>
+          <w:tcPr>
+            <w:tcW w:type="dxa" w:w="2835"/>
+          </w:tcPr>
+          <w:p>
+            <w:pPr>
+              <w:keepNext/>
+              <w:spacing w:after="40" w:line="252" w:lineRule="auto"/>
+            </w:pPr>
+            <w:r>
+              <w:rPr>
+                <w:b w:val="0"/>
+                <w:sz w:val="19"/>
+              </w:rPr>
+              <w:t>条件唯一反例</w:t>
+            </w:r>
+          </w:p>
+        </w:tc>
+        <w:tc>
+          <w:tcPr>
+            <w:tcW w:type="dxa" w:w="2835"/>
+          </w:tcPr>
+          <w:p>
+            <w:pPr>
+              <w:keepNext/>
+              <w:spacing w:after="40" w:line="252" w:lineRule="auto"/>
+            </w:pPr>
+            <w:r>
+              <w:rPr>
+                <w:b w:val="0"/>
+                <w:sz w:val="19"/>
+              </w:rPr>
+              <w:t>两位临时会员填相同非空号码00000000000</w:t>
+            </w:r>
+          </w:p>
+        </w:tc>
+        <w:tc>
+          <w:tcPr>
+            <w:tcW w:type="dxa" w:w="3969"/>
+          </w:tcPr>
+          <w:p>
+            <w:pPr>
+              <w:keepNext/>
+              <w:spacing w:after="40" w:line="252" w:lineRule="auto"/>
+            </w:pPr>
+            <w:r>
+              <w:rPr>
+                <w:b w:val="0"/>
+                <w:sz w:val="19"/>
+              </w:rPr>
+              <w:t>错误2601，UX_Member_Phone_NotNull；非空值必须唯一，多NULL允许。</w:t>
+            </w:r>
+          </w:p>
+        </w:tc>
+      </w:tr>
+      <w:tr>
+        <w:trPr>
+          <w:cantSplit/>
+        </w:trPr>
+        <w:tc>
+          <w:tcPr>
+            <w:tcW w:type="dxa" w:w="2835"/>
+          </w:tcPr>
+          <w:p>
+            <w:pPr>
+              <w:keepNext/>
+              <w:spacing w:after="40" w:line="252" w:lineRule="auto"/>
+            </w:pPr>
+            <w:r>
+              <w:rPr>
+                <w:b w:val="0"/>
+                <w:sz w:val="19"/>
+              </w:rPr>
+              <w:t>店员正常操作</w:t>
+            </w:r>
+          </w:p>
+        </w:tc>
+        <w:tc>
+          <w:tcPr>
+            <w:tcW w:type="dxa" w:w="2835"/>
+          </w:tcPr>
+          <w:p>
+            <w:pPr>
+              <w:keepNext/>
+              <w:spacing w:after="40" w:line="252" w:lineRule="auto"/>
+            </w:pPr>
+            <w:r>
+              <w:rPr>
+                <w:b w:val="0"/>
+                <w:sz w:val="19"/>
+              </w:rPr>
+              <w:t>读取菜单/销量，新增订单头及明细</w:t>
+            </w:r>
+          </w:p>
+        </w:tc>
+        <w:tc>
+          <w:tcPr>
+            <w:tcW w:type="dxa" w:w="3969"/>
+          </w:tcPr>
+          <w:p>
+            <w:pPr>
+              <w:keepNext/>
+              <w:spacing w:after="40" w:line="252" w:lineRule="auto"/>
+            </w:pPr>
+            <w:r>
+              <w:rPr>
+                <w:b w:val="0"/>
+                <w:sz w:val="19"/>
+              </w:rPr>
+              <w:t>ALLOWED，新增各影响1行。</w:t>
+            </w:r>
+          </w:p>
+        </w:tc>
+      </w:tr>
+      <w:tr>
+        <w:trPr>
+          <w:cantSplit/>
+        </w:trPr>
+        <w:tc>
+          <w:tcPr>
+            <w:tcW w:type="dxa" w:w="2835"/>
+          </w:tcPr>
+          <w:p>
+            <w:pPr>
+              <w:keepNext/>
+              <w:spacing w:after="40" w:line="252" w:lineRule="auto"/>
+            </w:pPr>
+            <w:r>
+              <w:rPr>
+                <w:b w:val="0"/>
+                <w:sz w:val="19"/>
+              </w:rPr>
+              <w:t>店员越权操作</w:t>
+            </w:r>
+          </w:p>
+        </w:tc>
+        <w:tc>
+          <w:tcPr>
+            <w:tcW w:type="dxa" w:w="2835"/>
+          </w:tcPr>
+          <w:p>
+            <w:pPr>
+              <w:keepNext/>
+              <w:spacing w:after="40" w:line="252" w:lineRule="auto"/>
+            </w:pPr>
+            <w:r>
+              <w:rPr>
+                <w:b w:val="0"/>
+                <w:sz w:val="19"/>
+              </w:rPr>
+              <w:t>改菜单价、改库存、读会员汇总</w:t>
+            </w:r>
+          </w:p>
+        </w:tc>
+        <w:tc>
+          <w:tcPr>
+            <w:tcW w:type="dxa" w:w="3969"/>
+          </w:tcPr>
+          <w:p>
+            <w:pPr>
+              <w:keepNext/>
+              <w:spacing w:after="40" w:line="252" w:lineRule="auto"/>
+            </w:pPr>
+            <w:r>
+              <w:rPr>
+                <w:b w:val="0"/>
+                <w:sz w:val="19"/>
+              </w:rPr>
+              <w:t>REJECTED，错误229；未授予的操作被拒绝。</w:t>
+            </w:r>
+          </w:p>
+        </w:tc>
+      </w:tr>
+      <w:tr>
+        <w:trPr>
+          <w:cantSplit/>
+        </w:trPr>
+        <w:tc>
+          <w:tcPr>
+            <w:tcW w:type="dxa" w:w="2835"/>
+          </w:tcPr>
+          <w:p>
+            <w:pPr>
+              <w:keepNext w:val="0"/>
+              <w:spacing w:after="40" w:line="252" w:lineRule="auto"/>
+            </w:pPr>
+            <w:r>
+              <w:rPr>
+                <w:b w:val="0"/>
+                <w:sz w:val="19"/>
+              </w:rPr>
+              <w:t>店长正常操作</w:t>
+            </w:r>
+          </w:p>
+        </w:tc>
+        <w:tc>
+          <w:tcPr>
+            <w:tcW w:type="dxa" w:w="2835"/>
+          </w:tcPr>
+          <w:p>
+            <w:pPr>
+              <w:keepNext w:val="0"/>
+              <w:spacing w:after="40" w:line="252" w:lineRule="auto"/>
+            </w:pPr>
+            <w:r>
+              <w:rPr>
+                <w:b w:val="0"/>
+                <w:sz w:val="19"/>
+              </w:rPr>
+              <w:t>改备售阈值、改库存、读会员汇总</w:t>
+            </w:r>
+          </w:p>
+        </w:tc>
+        <w:tc>
+          <w:tcPr>
+            <w:tcW w:type="dxa" w:w="3969"/>
+          </w:tcPr>
+          <w:p>
+            <w:pPr>
+              <w:keepNext w:val="0"/>
+              <w:spacing w:after="40" w:line="252" w:lineRule="auto"/>
+            </w:pPr>
+            <w:r>
+              <w:rPr>
+                <w:b w:val="0"/>
+                <w:sz w:val="19"/>
+              </w:rPr>
+              <w:t>ALLOWED，更新各1行，会员报表返回4行。</w:t>
+            </w:r>
+          </w:p>
+        </w:tc>
+      </w:tr>
+    </w:tbl>
+    <w:p>
+      <w:pPr>
+        <w:spacing w:after="0"/>
+      </w:pPr>
+    </w:p>
+    <w:p>
+      <w:pPr>
+        <w:pStyle w:val="Caption"/>
+        <w:keepNext/>
+      </w:pPr>
+      <w:r>
+        <w:t>图11  完整性正反例：合法默认值和NULL允许，非法值被拒绝</w:t>
+      </w:r>
+    </w:p>
+    <w:p>
+      <w:pPr>
+        <w:keepNext/>
+        <w:spacing w:after="60"/>
+      </w:pPr>
+      <w:r>
+        <w:drawing>
+          <wp:inline xmlns:a="http://schemas.openxmlformats.org/drawingml/2006/main" xmlns:pic="http://schemas.openxmlformats.org/drawingml/2006/picture">
+            <wp:extent cx="6120000" cy="2984152"/>
+            <wp:docPr id="11" name="Picture 11"/>
+            <wp:cNvGraphicFramePr>
+              <a:graphicFrameLocks noChangeAspect="1"/>
+            </wp:cNvGraphicFramePr>
+            <a:graphic>
+              <a:graphicData uri="http://schemas.openxmlformats.org/drawingml/2006/picture">
+                <pic:pic>
+                  <pic:nvPicPr>
+                    <pic:cNvPr id="0" name="05_constraints.png"/>
+                    <pic:cNvPicPr/>
+                  </pic:nvPicPr>
+                  <pic:blipFill>
+                    <a:blip r:embed="rId21"/>
+                    <a:stretch>
+                      <a:fillRect/>
+                    </a:stretch>
+                  </pic:blipFill>
+                  <pic:spPr>
+                    <a:xfrm>
+                      <a:off x="0" y="0"/>
+                      <a:ext cx="6120000" cy="2984152"/>
+                    </a:xfrm>
+                    <a:prstGeom prst="rect"/>
+                  </pic:spPr>
+                </pic:pic>
+              </a:graphicData>
+            </a:graphic>
+          </wp:inline>
+        </w:drawing>
+      </w:r>
+    </w:p>
+    <w:p>
+      <w:pPr>
+        <w:pStyle w:val="Caption"/>
+      </w:pPr>
+      <w:r>
+        <w:t>原始截图：result/screenshots/05_constraints.png</w:t>
+      </w:r>
+    </w:p>
+    <w:p>
+      <w:r>
+        <w:t>同一轮测试同时呈现ALLOWED与REJECTED，并核对真实错误号和约束名。合法对照说明默认值与可空设计能够实际使用。</w:t>
+      </w:r>
+    </w:p>
+    <w:p>
+      <w:pPr>
+        <w:pStyle w:val="Caption"/>
+        <w:keepNext/>
+      </w:pPr>
+      <w:r>
+        <w:t>图12  约束反例详情：唯一、外码、CHECK及非空错误，最终PASS13</w:t>
+      </w:r>
+    </w:p>
+    <w:p>
+      <w:pPr>
+        <w:keepNext/>
+        <w:spacing w:after="60"/>
+      </w:pPr>
+      <w:r>
+        <w:drawing>
+          <wp:inline xmlns:a="http://schemas.openxmlformats.org/drawingml/2006/main" xmlns:pic="http://schemas.openxmlformats.org/drawingml/2006/picture">
+            <wp:extent cx="6120000" cy="2984152"/>
+            <wp:docPr id="12" name="Picture 12"/>
+            <wp:cNvGraphicFramePr>
+              <a:graphicFrameLocks noChangeAspect="1"/>
+            </wp:cNvGraphicFramePr>
+            <a:graphic>
+              <a:graphicData uri="http://schemas.openxmlformats.org/drawingml/2006/picture">
+                <pic:pic>
+                  <pic:nvPicPr>
+                    <pic:cNvPr id="0" name="05_constraints_details.png"/>
+                    <pic:cNvPicPr/>
+                  </pic:nvPicPr>
+                  <pic:blipFill>
+                    <a:blip r:embed="rId22"/>
+                    <a:stretch>
+                      <a:fillRect/>
+                    </a:stretch>
+                  </pic:blipFill>
+                  <pic:spPr>
+                    <a:xfrm>
+                      <a:off x="0" y="0"/>
+                      <a:ext cx="6120000" cy="2984152"/>
+                    </a:xfrm>
+                    <a:prstGeom prst="rect"/>
+                  </pic:spPr>
+                </pic:pic>
+              </a:graphicData>
+            </a:graphic>
+          </wp:inline>
+        </w:drawing>
+      </w:r>
+    </w:p>
+    <w:p>
+      <w:pPr>
+        <w:pStyle w:val="Caption"/>
+      </w:pPr>
+      <w:r>
+        <w:t>原始截图：result/screenshots/05_constraints_details.png</w:t>
+      </w:r>
+    </w:p>
+    <w:p>
+      <w:r>
+        <w:t>错误547对应CHECK或外码，2627对应重复主码，2601对应过滤唯一索引，515对应非空字段。13项全部符合预期，测试记录回滚清理。</w:t>
+      </w:r>
+    </w:p>
+    <w:p>
+      <w:pPr>
+        <w:pStyle w:val="Caption"/>
+        <w:keepNext/>
+      </w:pPr>
+      <w:r>
+        <w:t>图13  不同角色权限：店员与店长的允许和越权拒绝，最终PASS12</w:t>
+      </w:r>
+    </w:p>
+    <w:p>
+      <w:pPr>
+        <w:keepNext/>
+        <w:spacing w:after="60"/>
+      </w:pPr>
+      <w:r>
+        <w:drawing>
+          <wp:inline xmlns:a="http://schemas.openxmlformats.org/drawingml/2006/main" xmlns:pic="http://schemas.openxmlformats.org/drawingml/2006/picture">
+            <wp:extent cx="6120000" cy="2984152"/>
+            <wp:docPr id="13" name="Picture 13"/>
+            <wp:cNvGraphicFramePr>
+              <a:graphicFrameLocks noChangeAspect="1"/>
+            </wp:cNvGraphicFramePr>
+            <a:graphic>
+              <a:graphicData uri="http://schemas.openxmlformats.org/drawingml/2006/picture">
+                <pic:pic>
+                  <pic:nvPicPr>
+                    <pic:cNvPr id="0" name="06_clerk_permissions.png"/>
+                    <pic:cNvPicPr/>
+                  </pic:nvPicPr>
+                  <pic:blipFill>
+                    <a:blip r:embed="rId23"/>
+                    <a:stretch>
+                      <a:fillRect/>
+                    </a:stretch>
+                  </pic:blipFill>
+                  <pic:spPr>
+                    <a:xfrm>
+                      <a:off x="0" y="0"/>
+                      <a:ext cx="6120000" cy="2984152"/>
+                    </a:xfrm>
+                    <a:prstGeom prst="rect"/>
+                  </pic:spPr>
+                </pic:pic>
+              </a:graphicData>
+            </a:graphic>
+          </wp:inline>
+        </w:drawing>
+      </w:r>
+    </w:p>
+    <w:p>
+      <w:pPr>
+        <w:pStyle w:val="Caption"/>
+      </w:pPr>
+      <w:r>
+        <w:t>原始截图：result/screenshots/06_clerk_permissions.png</w:t>
+      </w:r>
+    </w:p>
+    <w:p>
+      <w:r>
+        <w:t>结果表同时列出EffectiveUser、Outcome、RowsAffected和ErrorNumber，可以直接对照权限矩阵：店员越权均返回229，店长维护与会员报表读取成功。</w:t>
+      </w:r>
+    </w:p>
     <w:p>
       <w:pPr>
         <w:pStyle w:val="Heading2"/>
@@ -2042,6 +3879,130 @@
     <w:p>
       <w:r>
         <w:t>成功建库、结构与装载分别见00_database_creation.png、01_schema.png、01_seed.png；最终结果见08_acceptance.png。提交包result目录包含全部15张SSMS截图和完整文本输出，README列出验收项与文件入口。</w:t>
+      </w:r>
+    </w:p>
+    <w:p>
+      <w:pPr>
+        <w:pStyle w:val="Caption"/>
+        <w:keepNext/>
+      </w:pPr>
+      <w:r>
+        <w:t>图14  数据库概览：当前实验库和六张业务表</w:t>
+      </w:r>
+    </w:p>
+    <w:p>
+      <w:pPr>
+        <w:keepNext/>
+        <w:spacing w:after="60"/>
+      </w:pPr>
+      <w:r>
+        <w:drawing>
+          <wp:inline xmlns:a="http://schemas.openxmlformats.org/drawingml/2006/main" xmlns:pic="http://schemas.openxmlformats.org/drawingml/2006/picture">
+            <wp:extent cx="6120000" cy="2984152"/>
+            <wp:docPr id="14" name="Picture 14"/>
+            <wp:cNvGraphicFramePr>
+              <a:graphicFrameLocks noChangeAspect="1"/>
+            </wp:cNvGraphicFramePr>
+            <a:graphic>
+              <a:graphicData uri="http://schemas.openxmlformats.org/drawingml/2006/picture">
+                <pic:pic>
+                  <pic:nvPicPr>
+                    <pic:cNvPr id="0" name="01_database_and_tables.png"/>
+                    <pic:cNvPicPr/>
+                  </pic:nvPicPr>
+                  <pic:blipFill>
+                    <a:blip r:embed="rId24"/>
+                    <a:stretch>
+                      <a:fillRect/>
+                    </a:stretch>
+                  </pic:blipFill>
+                  <pic:spPr>
+                    <a:xfrm>
+                      <a:off x="0" y="0"/>
+                      <a:ext cx="6120000" cy="2984152"/>
+                    </a:xfrm>
+                    <a:prstGeom prst="rect"/>
+                  </pic:spPr>
+                </pic:pic>
+              </a:graphicData>
+            </a:graphic>
+          </wp:inline>
+        </w:drawing>
+      </w:r>
+    </w:p>
+    <w:p>
+      <w:pPr>
+        <w:pStyle w:val="Caption"/>
+      </w:pPr>
+      <w:r>
+        <w:t>原始截图：result/screenshots/01_database_and_tables.png</w:t>
+      </w:r>
+    </w:p>
+    <w:p>
+      <w:r>
+        <w:t>SQL10确认操作对象是MilkTeaShopV01，六表结构存在且与报告设计一致，便于复现者核对连接位置。</w:t>
+      </w:r>
+    </w:p>
+    <w:p>
+      <w:pPr>
+        <w:pStyle w:val="Caption"/>
+        <w:keepNext/>
+      </w:pPr>
+      <w:r>
+        <w:t>图15  最终验收：6表、4视图、6饮品、7订单、11明细及86.00元</w:t>
+      </w:r>
+    </w:p>
+    <w:p>
+      <w:pPr>
+        <w:keepNext/>
+        <w:spacing w:after="60"/>
+      </w:pPr>
+      <w:r>
+        <w:drawing>
+          <wp:inline xmlns:a="http://schemas.openxmlformats.org/drawingml/2006/main" xmlns:pic="http://schemas.openxmlformats.org/drawingml/2006/picture">
+            <wp:extent cx="6120000" cy="2984152"/>
+            <wp:docPr id="15" name="Picture 15"/>
+            <wp:cNvGraphicFramePr>
+              <a:graphicFrameLocks noChangeAspect="1"/>
+            </wp:cNvGraphicFramePr>
+            <a:graphic>
+              <a:graphicData uri="http://schemas.openxmlformats.org/drawingml/2006/picture">
+                <pic:pic>
+                  <pic:nvPicPr>
+                    <pic:cNvPr id="0" name="08_acceptance.png"/>
+                    <pic:cNvPicPr/>
+                  </pic:nvPicPr>
+                  <pic:blipFill>
+                    <a:blip r:embed="rId25"/>
+                    <a:stretch>
+                      <a:fillRect/>
+                    </a:stretch>
+                  </pic:blipFill>
+                  <pic:spPr>
+                    <a:xfrm>
+                      <a:off x="0" y="0"/>
+                      <a:ext cx="6120000" cy="2984152"/>
+                    </a:xfrm>
+                    <a:prstGeom prst="rect"/>
+                  </pic:spPr>
+                </pic:pic>
+              </a:graphicData>
+            </a:graphic>
+          </wp:inline>
+        </w:drawing>
+      </w:r>
+    </w:p>
+    <w:p>
+      <w:pPr>
+        <w:pStyle w:val="Caption"/>
+      </w:pPr>
+      <w:r>
+        <w:t>原始截图：result/screenshots/08_acceptance.png</w:t>
+      </w:r>
+    </w:p>
+    <w:p>
+      <w:r>
+        <w:t>SQL08实际返回PASS，固定基线及匿名、取消单、零销量/零消费、阈值、回滚清理等边界断言均通过；验收依据是数据库的实际结果。</w:t>
       </w:r>
     </w:p>
     <w:p>

</xml_diff>